<commit_message>
update | change links
</commit_message>
<xml_diff>
--- a/my-react-app/public/ClarenceCV.docx
+++ b/my-react-app/public/ClarenceCV.docx
@@ -24,21 +24,7 @@
         <w:rPr>
           <w:sz w:val="20"/>
         </w:rPr>
-        <w:t xml:space="preserve">📍 1409 Canuto Villanueva St., </w:t>
-      </w:r>
-      <w:proofErr w:type="spellStart"/>
-      <w:r>
-        <w:rPr>
-          <w:sz w:val="20"/>
-        </w:rPr>
-        <w:t>Caingin</w:t>
-      </w:r>
-      <w:proofErr w:type="spellEnd"/>
-      <w:r>
-        <w:rPr>
-          <w:sz w:val="20"/>
-        </w:rPr>
-        <w:t>, Bocaue, Bulacan | 📞 (+63) 961 261 4463 | 📧 legaspi.johnclarence@dyci.edu.ph</w:t>
+        <w:t>📍 1409 Canuto Villanueva St., Caingin, Bocaue, Bulacan | 📞 (+63) 961 261 4463 | 📧 legaspi.johnclarence@dyci.edu.ph</w:t>
       </w:r>
     </w:p>
     <w:p>
@@ -51,13 +37,15 @@
     </w:p>
     <w:p>
       <w:pPr>
-        <w:spacing w:after="0"/>
+        <w:rPr>
+          <w:lang w:val="en-PH"/>
+        </w:rPr>
       </w:pPr>
       <w:r>
-        <w:t>An Information Technology graduate with hands-on experience in web development, game development, and UI/UX design. Skilled in frontend and backend technologies, with leadership experience in team-based projects. Holds certifications in Cybersecurity, Agile Project Management, and Network Fundamentals. Passionate about building scalable, user-friendly solutions</w:t>
-      </w:r>
-      <w:r>
-        <w:t>.</w:t>
+        <w:rPr>
+          <w:lang w:val="en-PH"/>
+        </w:rPr>
+        <w:t>An Information Technology graduate with hands-on experience in web development, game development, and UI/UX design. Skilled in frontend and backend technologies, with leadership experience in team-based projects. Holds certifications in Cybersecurity, Predictive Project Management, and Networking Basics. Passionate about building scalable, user-friendly solutions.</w:t>
       </w:r>
     </w:p>
     <w:p>
@@ -196,7 +184,7 @@
         <w:rPr>
           <w:lang w:val="en-PH"/>
         </w:rPr>
-        <w:t>Agile collaboration, Problem-solving</w:t>
+        <w:t>Agile collaboration</w:t>
       </w:r>
     </w:p>
     <w:p>
@@ -526,23 +514,13 @@
           <w:lang w:val="en-PH"/>
         </w:rPr>
       </w:pPr>
-      <w:proofErr w:type="spellStart"/>
       <w:r>
         <w:rPr>
           <w:b/>
           <w:bCs/>
           <w:lang w:val="en-PH"/>
         </w:rPr>
-        <w:t>DaMath</w:t>
-      </w:r>
-      <w:proofErr w:type="spellEnd"/>
-      <w:r>
-        <w:rPr>
-          <w:b/>
-          <w:bCs/>
-          <w:lang w:val="en-PH"/>
-        </w:rPr>
-        <w:t xml:space="preserve"> Educational Game — </w:t>
+        <w:t>DaMath Educational Game — </w:t>
       </w:r>
       <w:r>
         <w:rPr>
@@ -616,21 +594,7 @@
         <w:rPr>
           <w:lang w:val="en-PH"/>
         </w:rPr>
-        <w:t xml:space="preserve">Developed an augmented reality mobile application using </w:t>
-      </w:r>
-      <w:proofErr w:type="spellStart"/>
-      <w:r>
-        <w:rPr>
-          <w:lang w:val="en-PH"/>
-        </w:rPr>
-        <w:t>ARCore</w:t>
-      </w:r>
-      <w:proofErr w:type="spellEnd"/>
-      <w:r>
-        <w:rPr>
-          <w:lang w:val="en-PH"/>
-        </w:rPr>
-        <w:t xml:space="preserve"> and C#</w:t>
+        <w:t>Developed an augmented reality mobile application using ARCore and C#</w:t>
       </w:r>
     </w:p>
     <w:p>
@@ -666,21 +630,7 @@
         <w:rPr>
           <w:lang w:val="en-PH"/>
         </w:rPr>
-        <w:t xml:space="preserve">Integrated </w:t>
-      </w:r>
-      <w:proofErr w:type="spellStart"/>
-      <w:r>
-        <w:rPr>
-          <w:lang w:val="en-PH"/>
-        </w:rPr>
-        <w:t>ARCore</w:t>
-      </w:r>
-      <w:proofErr w:type="spellEnd"/>
-      <w:r>
-        <w:rPr>
-          <w:lang w:val="en-PH"/>
-        </w:rPr>
-        <w:t xml:space="preserve"> functionalities to deliver a fully functional and engaging AR learning experience.</w:t>
+        <w:t>Integrated ARCore functionalities to deliver a fully functional and engaging AR learning experience.</w:t>
       </w:r>
     </w:p>
     <w:p>
@@ -697,7 +647,22 @@
         <w:spacing w:after="0"/>
       </w:pPr>
       <w:r>
-        <w:t>Cybersecurity</w:t>
+        <w:t xml:space="preserve">Introduction to Cybersecurity </w:t>
+      </w:r>
+      <w:r>
+        <w:rPr>
+          <w:b/>
+          <w:bCs/>
+          <w:lang w:val="en-PH"/>
+        </w:rPr>
+        <w:t>— </w:t>
+      </w:r>
+      <w:r>
+        <w:rPr>
+          <w:b/>
+          <w:bCs/>
+        </w:rPr>
+        <w:t>Cisco · Issued Dec 2023</w:t>
       </w:r>
     </w:p>
     <w:p>
@@ -706,7 +671,51 @@
         <w:spacing w:after="0"/>
       </w:pPr>
       <w:r>
-        <w:t>Agile Project Management</w:t>
+        <w:t xml:space="preserve">Networking Basics </w:t>
+      </w:r>
+      <w:r>
+        <w:rPr>
+          <w:b/>
+          <w:bCs/>
+          <w:lang w:val="en-PH"/>
+        </w:rPr>
+        <w:t>—</w:t>
+      </w:r>
+      <w:r>
+        <w:rPr>
+          <w:b/>
+          <w:bCs/>
+          <w:lang w:val="en-PH"/>
+        </w:rPr>
+        <w:t xml:space="preserve"> </w:t>
+      </w:r>
+      <w:r>
+        <w:rPr>
+          <w:b/>
+          <w:bCs/>
+        </w:rPr>
+        <w:t xml:space="preserve">Cisco · Issued </w:t>
+      </w:r>
+      <w:r>
+        <w:rPr>
+          <w:b/>
+          <w:bCs/>
+        </w:rPr>
+        <w:t>May</w:t>
+      </w:r>
+      <w:r>
+        <w:rPr>
+          <w:b/>
+          <w:bCs/>
+        </w:rPr>
+        <w:t xml:space="preserve"> 202</w:t>
+      </w:r>
+      <w:r>
+        <w:rPr>
+          <w:b/>
+          <w:bCs/>
+        </w:rPr>
+        <w:t>4</w:t>
       </w:r>
     </w:p>
     <w:p>
@@ -715,7 +724,115 @@
         <w:spacing w:after="0"/>
       </w:pPr>
       <w:r>
-        <w:t>Network Fundamentals</w:t>
+        <w:t xml:space="preserve">Fundamentals of Predictive Project Management </w:t>
+      </w:r>
+      <w:r>
+        <w:rPr>
+          <w:b/>
+          <w:bCs/>
+          <w:lang w:val="en-PH"/>
+        </w:rPr>
+        <w:t>— </w:t>
+      </w:r>
+      <w:r>
+        <w:rPr>
+          <w:b/>
+          <w:bCs/>
+          <w:lang w:val="en-PH"/>
+        </w:rPr>
+        <w:t>Project Management Institute</w:t>
+      </w:r>
+      <w:r>
+        <w:rPr>
+          <w:b/>
+          <w:bCs/>
+          <w:lang w:val="en-PH"/>
+        </w:rPr>
+        <w:t xml:space="preserve"> </w:t>
+      </w:r>
+      <w:r>
+        <w:rPr>
+          <w:b/>
+          <w:bCs/>
+        </w:rPr>
+        <w:t xml:space="preserve">· Issued </w:t>
+      </w:r>
+      <w:r>
+        <w:rPr>
+          <w:b/>
+          <w:bCs/>
+        </w:rPr>
+        <w:t>Sep</w:t>
+      </w:r>
+      <w:r>
+        <w:rPr>
+          <w:b/>
+          <w:bCs/>
+        </w:rPr>
+        <w:t xml:space="preserve"> 202</w:t>
+      </w:r>
+      <w:r>
+        <w:rPr>
+          <w:b/>
+          <w:bCs/>
+        </w:rPr>
+        <w:t>3</w:t>
+      </w:r>
+    </w:p>
+    <w:p>
+      <w:pPr>
+        <w:pStyle w:val="ListBullet"/>
+        <w:spacing w:after="0"/>
+      </w:pPr>
+      <w:r>
+        <w:rPr>
+          <w:lang w:val="en-PH"/>
+        </w:rPr>
+        <w:t xml:space="preserve">Microsoft Office Excel Associate </w:t>
+      </w:r>
+      <w:r>
+        <w:rPr>
+          <w:b/>
+          <w:bCs/>
+          <w:lang w:val="en-PH"/>
+        </w:rPr>
+        <w:t>— </w:t>
+      </w:r>
+      <w:r>
+        <w:rPr>
+          <w:b/>
+          <w:bCs/>
+          <w:lang w:val="en-PH"/>
+        </w:rPr>
+        <w:t xml:space="preserve">Certiport </w:t>
+      </w:r>
+      <w:r>
+        <w:rPr>
+          <w:b/>
+          <w:bCs/>
+        </w:rPr>
+        <w:t xml:space="preserve">· Issued </w:t>
+      </w:r>
+      <w:r>
+        <w:rPr>
+          <w:b/>
+          <w:bCs/>
+        </w:rPr>
+        <w:t>June</w:t>
+      </w:r>
+      <w:r>
+        <w:rPr>
+          <w:b/>
+          <w:bCs/>
+        </w:rPr>
+        <w:t xml:space="preserve"> 202</w:t>
+      </w:r>
+      <w:r>
+        <w:rPr>
+          <w:b/>
+          <w:bCs/>
+        </w:rPr>
+        <w:t>3</w:t>
       </w:r>
     </w:p>
     <w:p>
@@ -910,7 +1027,7 @@
   <w:abstractNum w:abstractNumId="8" w15:restartNumberingAfterBreak="0">
     <w:nsid w:val="FFFFFF89"/>
     <w:multiLevelType w:val="singleLevel"/>
-    <w:tmpl w:val="29761A62"/>
+    <w:tmpl w:val="53A44370"/>
     <w:lvl w:ilvl="0">
       <w:start w:val="1"/>
       <w:numFmt w:val="bullet"/>

</xml_diff>

<commit_message>
picture added | some changes
Changes done.
To add:
pictures
</commit_message>
<xml_diff>
--- a/my-react-app/public/ClarenceCV.docx
+++ b/my-react-app/public/ClarenceCV.docx
@@ -24,7 +24,25 @@
         <w:rPr>
           <w:sz w:val="20"/>
         </w:rPr>
-        <w:t>📍 1409 Canuto Villanueva St., Caingin, Bocaue, Bulacan | 📞 (+63) 961 261 4463 | 📧 legaspi.johnclarence@dyci.edu.ph</w:t>
+        <w:t xml:space="preserve">📍 1409 Canuto Villanueva St., Caingin, Bocaue, Bulacan | 📞 (+63) 961 261 4463 | 📧 </w:t>
+      </w:r>
+      <w:r>
+        <w:rPr>
+          <w:sz w:val="20"/>
+        </w:rPr>
+        <w:t>clarence.legaspi.dev</w:t>
+      </w:r>
+      <w:r>
+        <w:rPr>
+          <w:sz w:val="20"/>
+        </w:rPr>
+        <w:t>@</w:t>
+      </w:r>
+      <w:r>
+        <w:rPr>
+          <w:sz w:val="20"/>
+        </w:rPr>
+        <w:t>gmail.com</w:t>
       </w:r>
     </w:p>
     <w:p>
@@ -639,30 +657,6 @@
       </w:pPr>
       <w:r>
         <w:t>Certifications</w:t>
-      </w:r>
-    </w:p>
-    <w:p>
-      <w:pPr>
-        <w:pStyle w:val="ListBullet"/>
-        <w:spacing w:after="0"/>
-      </w:pPr>
-      <w:r>
-        <w:t xml:space="preserve">Introduction to Cybersecurity </w:t>
-      </w:r>
-      <w:r>
-        <w:rPr>
-          <w:b/>
-          <w:bCs/>
-          <w:lang w:val="en-PH"/>
-        </w:rPr>
-        <w:t>— </w:t>
-      </w:r>
-      <w:r>
-        <w:rPr>
-          <w:b/>
-          <w:bCs/>
-        </w:rPr>
-        <w:t>Cisco · Issued Dec 2023</w:t>
       </w:r>
     </w:p>
     <w:p>
@@ -716,6 +710,30 @@
           <w:bCs/>
         </w:rPr>
         <w:t>4</w:t>
+      </w:r>
+    </w:p>
+    <w:p>
+      <w:pPr>
+        <w:pStyle w:val="ListBullet"/>
+        <w:spacing w:after="0"/>
+      </w:pPr>
+      <w:r>
+        <w:t xml:space="preserve">Introduction to Cybersecurity </w:t>
+      </w:r>
+      <w:r>
+        <w:rPr>
+          <w:b/>
+          <w:bCs/>
+          <w:lang w:val="en-PH"/>
+        </w:rPr>
+        <w:t>— </w:t>
+      </w:r>
+      <w:r>
+        <w:rPr>
+          <w:b/>
+          <w:bCs/>
+        </w:rPr>
+        <w:t>Cisco · Issued Dec 2023</w:t>
       </w:r>
     </w:p>
     <w:p>

</xml_diff>